<commit_message>
Fix figure rendering: working Hebrew, no overlap/clipping, corrected content
</commit_message>
<xml_diff>
--- a/Rabboni_Formatted.docx
+++ b/Rabboni_Formatted.docx
@@ -307,7 +307,7 @@
       <w:r>
         <w:drawing>
           <wp:inline xmlns:a="http://schemas.openxmlformats.org/drawingml/2006/main" xmlns:pic="http://schemas.openxmlformats.org/drawingml/2006/picture">
-            <wp:extent cx="5394960" cy="3037133"/>
+            <wp:extent cx="5394960" cy="3087803"/>
             <wp:docPr id="1" name="Picture 1"/>
             <wp:cNvGraphicFramePr>
               <a:graphicFrameLocks noChangeAspect="1"/>
@@ -328,7 +328,7 @@
                   <pic:spPr>
                     <a:xfrm>
                       <a:off x="0" y="0"/>
-                      <a:ext cx="5394960" cy="3037133"/>
+                      <a:ext cx="5394960" cy="3087803"/>
                     </a:xfrm>
                     <a:prstGeom prst="rect"/>
                   </pic:spPr>
@@ -379,7 +379,7 @@
       <w:r>
         <w:drawing>
           <wp:inline xmlns:a="http://schemas.openxmlformats.org/drawingml/2006/main" xmlns:pic="http://schemas.openxmlformats.org/drawingml/2006/picture">
-            <wp:extent cx="5394960" cy="3580142"/>
+            <wp:extent cx="5394960" cy="3591307"/>
             <wp:docPr id="2" name="Picture 2"/>
             <wp:cNvGraphicFramePr>
               <a:graphicFrameLocks noChangeAspect="1"/>
@@ -400,7 +400,7 @@
                   <pic:spPr>
                     <a:xfrm>
                       <a:off x="0" y="0"/>
-                      <a:ext cx="5394960" cy="3580142"/>
+                      <a:ext cx="5394960" cy="3591307"/>
                     </a:xfrm>
                     <a:prstGeom prst="rect"/>
                   </pic:spPr>
@@ -493,7 +493,7 @@
       <w:r>
         <w:drawing>
           <wp:inline xmlns:a="http://schemas.openxmlformats.org/drawingml/2006/main" xmlns:pic="http://schemas.openxmlformats.org/drawingml/2006/picture">
-            <wp:extent cx="5394960" cy="2380129"/>
+            <wp:extent cx="5394960" cy="2810273"/>
             <wp:docPr id="3" name="Picture 3"/>
             <wp:cNvGraphicFramePr>
               <a:graphicFrameLocks noChangeAspect="1"/>
@@ -514,7 +514,7 @@
                   <pic:spPr>
                     <a:xfrm>
                       <a:off x="0" y="0"/>
-                      <a:ext cx="5394960" cy="2380129"/>
+                      <a:ext cx="5394960" cy="2810273"/>
                     </a:xfrm>
                     <a:prstGeom prst="rect"/>
                   </pic:spPr>
@@ -578,7 +578,7 @@
       <w:r>
         <w:drawing>
           <wp:inline xmlns:a="http://schemas.openxmlformats.org/drawingml/2006/main" xmlns:pic="http://schemas.openxmlformats.org/drawingml/2006/picture">
-            <wp:extent cx="5394960" cy="2538805"/>
+            <wp:extent cx="5394960" cy="2987413"/>
             <wp:docPr id="4" name="Picture 4"/>
             <wp:cNvGraphicFramePr>
               <a:graphicFrameLocks noChangeAspect="1"/>
@@ -599,7 +599,7 @@
                   <pic:spPr>
                     <a:xfrm>
                       <a:off x="0" y="0"/>
-                      <a:ext cx="5394960" cy="2538805"/>
+                      <a:ext cx="5394960" cy="2987413"/>
                     </a:xfrm>
                     <a:prstGeom prst="rect"/>
                   </pic:spPr>
@@ -691,7 +691,7 @@
       <w:r>
         <w:drawing>
           <wp:inline xmlns:a="http://schemas.openxmlformats.org/drawingml/2006/main" xmlns:pic="http://schemas.openxmlformats.org/drawingml/2006/picture">
-            <wp:extent cx="5394960" cy="2697480"/>
+            <wp:extent cx="5394960" cy="3277346"/>
             <wp:docPr id="5" name="Picture 5"/>
             <wp:cNvGraphicFramePr>
               <a:graphicFrameLocks noChangeAspect="1"/>
@@ -712,7 +712,7 @@
                   <pic:spPr>
                     <a:xfrm>
                       <a:off x="0" y="0"/>
-                      <a:ext cx="5394960" cy="2697480"/>
+                      <a:ext cx="5394960" cy="3277346"/>
                     </a:xfrm>
                     <a:prstGeom prst="rect"/>
                   </pic:spPr>
@@ -984,7 +984,7 @@
       <w:r>
         <w:drawing>
           <wp:inline xmlns:a="http://schemas.openxmlformats.org/drawingml/2006/main" xmlns:pic="http://schemas.openxmlformats.org/drawingml/2006/picture">
-            <wp:extent cx="5394960" cy="3014831"/>
+            <wp:extent cx="5394960" cy="3513797"/>
             <wp:docPr id="7" name="Picture 7"/>
             <wp:cNvGraphicFramePr>
               <a:graphicFrameLocks noChangeAspect="1"/>
@@ -1005,7 +1005,7 @@
                   <pic:spPr>
                     <a:xfrm>
                       <a:off x="0" y="0"/>
-                      <a:ext cx="5394960" cy="3014831"/>
+                      <a:ext cx="5394960" cy="3513797"/>
                     </a:xfrm>
                     <a:prstGeom prst="rect"/>
                   </pic:spPr>

</xml_diff>